<commit_message>
Quitar el bono de cultura general
Se elimina la regla de +3 puntos por acertar una carta de cada una de
las cinco materias. Queda el sistema de puntaje en dos reglas: acertar
suma 1, 2 o 3 segun el nivel, y errar resta 1 sin bajar de cero.

Ajustes que arrastra:
- Reglas: la seccion "Los puntos" queda con los tres niveles y un solo
  panel, el de restar un punto, a todo el ancho.
- Hoja de puntaje: se va el bloque de casilleros por materia y la tabla
  vuelve de 16 a 20 turnos.
- Sistema de puntajes: "las dos reglas" en lugar de tres, y el ejemplo
  se rehizo con los totales recalculados.
- Presentacion: la diapositiva del puntaje pasa de tres tarjetas a dos.
- Informe (pdf y docx): sale la regla y tambien la justificacion de por
  que se habia agregado.
- README.

De paso se corrige la redaccion de "en vez de al mas dificil", que
estaba mal construida, en las reglas y en el sistema de puntajes.
</commit_message>
<xml_diff>
--- a/presentacion/Informe_del_juego.docx
+++ b/presentacion/Informe_del_juego.docx
@@ -635,16 +635,7 @@
         <w:t>resta 1 punto</w:t>
       </w:r>
       <w:r>
-        <w:t xml:space="preserve">, sin bajar nunca de cero. Existe además un </w:t>
-      </w:r>
-      <w:r>
-        <w:rPr>
-          <w:b/>
-        </w:rPr>
-        <w:t>bono de cultura general de +3 puntos</w:t>
-      </w:r>
-      <w:r>
-        <w:t>, que se cobra una sola vez, la primera vez que un jugador acierta al menos una carta de cada una de las cinco materias. Si cae la torre, quien la tiró pierde todos sus puntos y la partida termina.</w:t>
+        <w:t>, sin bajar nunca de cero. Si cae la torre, quien la tiró pierde todos sus puntos y la partida termina.</w:t>
       </w:r>
     </w:p>
     <w:p>
@@ -652,7 +643,7 @@
         <w:jc w:val="both"/>
       </w:pPr>
       <w:r>
-        <w:t>Las dos últimas reglas no estaban en la primera versión: se incorporaron después de probar el juego, porque sin ellas aparecían dos problemas.</w:t>
+        <w:t>El castigo por errar no estaba en la primera versión: se incorporó después de probar el juego, porque sin él aparecía un problema.</w:t>
       </w:r>
     </w:p>
     <w:p>
@@ -668,21 +659,6 @@
       </w:r>
       <w:r>
         <w:t xml:space="preserve"> Si fallar no cuesta nada, siempre conviene sacar el bloque más difícil que se pueda alcanzar: en el peor caso no se gana nada, pero tampoco se pierde. Los bloques de nivel 1 no los elegía nadie.</w:t>
-      </w:r>
-    </w:p>
-    <w:p>
-      <w:pPr>
-        <w:ind w:left="454" w:right="454"/>
-        <w:jc w:val="both"/>
-      </w:pPr>
-      <w:r>
-        <w:rPr>
-          <w:b/>
-        </w:rPr>
-        <w:t>Sin el bono, convenía encerrarse en una sola materia.</w:t>
-      </w:r>
-      <w:r>
-        <w:t xml:space="preserve"> Como el color se ve antes de sacar el bloque, un jugador bueno en Historia podía pasar la partida eligiendo bloques rojos y no tocar nunca uno verde. En un juego de cultura general, eso es justamente lo que no se busca premiar.</w:t>
       </w:r>
     </w:p>
     <w:p>

</xml_diff>